<commit_message>
docs(revisao): GS, PN, RP, RS e TC revisados pelo Agnaldo (22/10/2026), salvos antes de aplicar
Co-Authored-By: Claude Opus 5.5 <noreply@anthropic.com>
</commit_message>
<xml_diff>
--- a/docs/revisao-conteudo/RS-Radar-Sazonal.docx
+++ b/docs/revisao-conteudo/RS-Radar-Sazonal.docx
@@ -105,56 +105,7 @@
           <w:sz w:val="20"/>
           <w:szCs w:val="20"/>
         </w:rPr>
-        <w:t>Não</w:t>
-      </w:r>
-      <w:r>
-        <w:rPr>
-          <w:sz w:val="20"/>
-          <w:szCs w:val="20"/>
-        </w:rPr>
-        <w:t xml:space="preserve"> apague o </w:t>
-      </w:r>
-      <w:r>
-        <w:rPr>
-          <w:sz w:val="20"/>
-          <w:szCs w:val="20"/>
-        </w:rPr>
-        <w:t>código</w:t>
-      </w:r>
-      <w:r>
-        <w:rPr>
-          <w:sz w:val="20"/>
-          <w:szCs w:val="20"/>
-        </w:rPr>
-        <w:t xml:space="preserve"> cinza no </w:t>
-      </w:r>
-      <w:r>
-        <w:rPr>
-          <w:sz w:val="20"/>
-          <w:szCs w:val="20"/>
-        </w:rPr>
-        <w:t>início</w:t>
-      </w:r>
-      <w:r>
-        <w:rPr>
-          <w:sz w:val="20"/>
-          <w:szCs w:val="20"/>
-        </w:rPr>
-        <w:t xml:space="preserve"> do </w:t>
-      </w:r>
-      <w:r>
-        <w:rPr>
-          <w:sz w:val="20"/>
-          <w:szCs w:val="20"/>
-        </w:rPr>
-        <w:t>parágrafo</w:t>
-      </w:r>
-      <w:r>
-        <w:rPr>
-          <w:sz w:val="20"/>
-          <w:szCs w:val="20"/>
-        </w:rPr>
-        <w:t>. E por ele que o texto volta para o lugar certo no app.</w:t>
+        <w:t>Não apague o código cinza no início do parágrafo. E por ele que o texto volta para o lugar certo no app.</w:t>
       </w:r>
     </w:p>
     <w:p>
@@ -261,70 +212,7 @@
           <w:sz w:val="20"/>
           <w:szCs w:val="20"/>
         </w:rPr>
-        <w:t>Dúvida</w:t>
-      </w:r>
-      <w:r>
-        <w:rPr>
-          <w:sz w:val="20"/>
-          <w:szCs w:val="20"/>
-        </w:rPr>
-        <w:t xml:space="preserve"> ou </w:t>
-      </w:r>
-      <w:r>
-        <w:rPr>
-          <w:sz w:val="20"/>
-          <w:szCs w:val="20"/>
-        </w:rPr>
-        <w:t>comentário</w:t>
-      </w:r>
-      <w:r>
-        <w:rPr>
-          <w:sz w:val="20"/>
-          <w:szCs w:val="20"/>
-        </w:rPr>
-        <w:t xml:space="preserve">: use o </w:t>
-      </w:r>
-      <w:r>
-        <w:rPr>
-          <w:sz w:val="20"/>
-          <w:szCs w:val="20"/>
-        </w:rPr>
-        <w:t>comentário</w:t>
-      </w:r>
-      <w:r>
-        <w:rPr>
-          <w:sz w:val="20"/>
-          <w:szCs w:val="20"/>
-        </w:rPr>
-        <w:t xml:space="preserve"> do Word (</w:t>
-      </w:r>
-      <w:r>
-        <w:rPr>
-          <w:sz w:val="20"/>
-          <w:szCs w:val="20"/>
-        </w:rPr>
-        <w:t>Revisão</w:t>
-      </w:r>
-      <w:r>
-        <w:rPr>
-          <w:sz w:val="20"/>
-          <w:szCs w:val="20"/>
-        </w:rPr>
-        <w:t xml:space="preserve"> &gt; Novo </w:t>
-      </w:r>
-      <w:r>
-        <w:rPr>
-          <w:sz w:val="20"/>
-          <w:szCs w:val="20"/>
-        </w:rPr>
-        <w:t>Comentário</w:t>
-      </w:r>
-      <w:r>
-        <w:rPr>
-          <w:sz w:val="20"/>
-          <w:szCs w:val="20"/>
-        </w:rPr>
-        <w:t>). Eu leio.</w:t>
+        <w:t>Dúvida ou comentário: use o comentário do Word (Revisão &gt; Novo Comentário). Eu leio.</w:t>
       </w:r>
     </w:p>
     <w:p>
@@ -401,7 +289,6 @@
           <w:b/>
           <w:bCs/>
         </w:rPr>
-        <w:lastRenderedPageBreak/>
         <w:t>Indice</w:t>
       </w:r>
     </w:p>
@@ -448,7 +335,6 @@
           <w:sz w:val="34"/>
           <w:szCs w:val="34"/>
         </w:rPr>
-        <w:lastRenderedPageBreak/>
         <w:t>Brasil</w:t>
       </w:r>
     </w:p>
@@ -854,7 +740,6 @@
           <w:sz w:val="14"/>
           <w:szCs w:val="14"/>
         </w:rPr>
-        <w:lastRenderedPageBreak/>
         <w:t xml:space="preserve">RS-0017  </w:t>
       </w:r>
       <w:r>
@@ -1031,12 +916,31 @@
         </w:rPr>
         <w:t xml:space="preserve">RS-0025  </w:t>
       </w:r>
-      <w:r>
-        <w:rPr>
-          <w:b/>
-          <w:bCs/>
-        </w:rPr>
-        <w:t>Quadra chuvosa no litoral do Nordeste</w:t>
+      <w:commentRangeStart w:id="0"/>
+      <w:r>
+        <w:rPr>
+          <w:b/>
+          <w:bCs/>
+        </w:rPr>
+        <w:t>Quadra</w:t>
+      </w:r>
+      <w:commentRangeEnd w:id="0"/>
+      <w:r>
+        <w:rPr>
+          <w:rStyle w:val="Refdecomentrio"/>
+          <w:b/>
+          <w:bCs/>
+          <w:sz w:val="26"/>
+          <w:szCs w:val="26"/>
+        </w:rPr>
+        <w:commentReference w:id="0"/>
+      </w:r>
+      <w:r>
+        <w:rPr>
+          <w:b/>
+          <w:bCs/>
+        </w:rPr>
+        <w:t xml:space="preserve"> chuvosa no litoral do Nordeste</w:t>
       </w:r>
     </w:p>
     <w:p>
@@ -1255,7 +1159,6 @@
           <w:sz w:val="14"/>
           <w:szCs w:val="14"/>
         </w:rPr>
-        <w:lastRenderedPageBreak/>
         <w:t xml:space="preserve">RS-0034  </w:t>
       </w:r>
       <w:r>
@@ -1281,7 +1184,24 @@
           <w:b/>
           <w:bCs/>
         </w:rPr>
-        <w:t>Dengue: o criadouro está dentro de casa</w:t>
+        <w:t xml:space="preserve">Dengue: o criadouro está </w:t>
+      </w:r>
+      <w:commentRangeStart w:id="1"/>
+      <w:r>
+        <w:rPr>
+          <w:b/>
+          <w:bCs/>
+        </w:rPr>
+        <w:t>dentro de casa</w:t>
+      </w:r>
+      <w:commentRangeEnd w:id="1"/>
+      <w:r>
+        <w:rPr>
+          <w:rStyle w:val="Refdecomentrio"/>
+          <w:sz w:val="26"/>
+          <w:szCs w:val="26"/>
+        </w:rPr>
+        <w:commentReference w:id="1"/>
       </w:r>
     </w:p>
     <w:p>
@@ -1659,7 +1579,6 @@
           <w:sz w:val="14"/>
           <w:szCs w:val="14"/>
         </w:rPr>
-        <w:lastRenderedPageBreak/>
         <w:t xml:space="preserve">RS-0051  </w:t>
       </w:r>
       <w:r>
@@ -1680,7 +1599,13 @@
         <w:t xml:space="preserve">RS-0052  </w:t>
       </w:r>
       <w:r>
-        <w:t>Pets presos em lugar fechado e com identificação: o barulho faz cães e gatos fugirem.</w:t>
+        <w:t xml:space="preserve">Pets presos em lugar fechado e com identificação: o barulho </w:t>
+      </w:r>
+      <w:r>
+        <w:t xml:space="preserve">provoca stress severo e </w:t>
+      </w:r>
+      <w:r>
+        <w:t>faz cães e gatos fugirem.</w:t>
       </w:r>
     </w:p>
     <w:p>
@@ -1752,7 +1677,13 @@
         <w:t xml:space="preserve">RS-0055  </w:t>
       </w:r>
       <w:r>
-        <w:t>O monóxido de carbono não tem cheiro nem cor e mata durante o sono. No inverno, bombeiros registram mais casos com aquecedor a gás, lareira, braseiro e até vasilha de álcool em quarto fechado.</w:t>
+        <w:t xml:space="preserve">O monóxido de carbono </w:t>
+      </w:r>
+      <w:r>
+        <w:t xml:space="preserve">(CO) </w:t>
+      </w:r>
+      <w:r>
+        <w:t>não tem cheiro nem cor e mata durante o sono. No inverno, bombeiros registram mais casos com aquecedor a gás, lareira, braseiro e até vasilha de álcool em quarto fechado.</w:t>
       </w:r>
     </w:p>
     <w:p>
@@ -1916,7 +1847,25 @@
         <w:t xml:space="preserve">RS-0062  </w:t>
       </w:r>
       <w:r>
-        <w:t>Umidade do ar muito baixa e fumaça de queimadas agravam asma, bronquite e doenças do coração — principalmente em bebês e idosos. E fogo em terreno ou quintal vira incêndio rápido.</w:t>
+        <w:t xml:space="preserve">Umidade do ar muito baixa e fumaça de queimadas agravam asma, bronquite e doenças do coração — principalmente em bebês e idosos. E fogo em terreno ou quintal </w:t>
+      </w:r>
+      <w:r>
+        <w:t xml:space="preserve">pode </w:t>
+      </w:r>
+      <w:r>
+        <w:t>vira</w:t>
+      </w:r>
+      <w:r>
+        <w:t>r</w:t>
+      </w:r>
+      <w:r>
+        <w:t xml:space="preserve"> incêndio r</w:t>
+      </w:r>
+      <w:r>
+        <w:t>apidamente</w:t>
+      </w:r>
+      <w:r>
+        <w:t>.</w:t>
       </w:r>
     </w:p>
     <w:p>
@@ -2052,7 +2001,6 @@
           <w:sz w:val="14"/>
           <w:szCs w:val="14"/>
         </w:rPr>
-        <w:lastRenderedPageBreak/>
         <w:t xml:space="preserve">RS-0068  </w:t>
       </w:r>
       <w:r>
@@ -2241,6 +2189,7 @@
       <w:pPr>
         <w:spacing w:after="160" w:line="300" w:lineRule="auto"/>
       </w:pPr>
+      <w:commentRangeStart w:id="2"/>
       <w:r>
         <w:rPr>
           <w:rFonts w:ascii="Consolas" w:eastAsia="Consolas" w:hAnsi="Consolas" w:cs="Consolas"/>
@@ -2253,6 +2202,15 @@
       <w:r>
         <w:t>Linha com cerol ou chilena: nunca. Além de perigosa, é proibida em vários estados.</w:t>
       </w:r>
+      <w:commentRangeEnd w:id="2"/>
+      <w:r>
+        <w:rPr>
+          <w:rStyle w:val="Refdecomentrio"/>
+          <w:sz w:val="22"/>
+          <w:szCs w:val="22"/>
+        </w:rPr>
+        <w:commentReference w:id="2"/>
+      </w:r>
     </w:p>
     <w:p>
       <w:pPr>
@@ -2293,6 +2251,14 @@
         <w:spacing w:after="160" w:line="300" w:lineRule="auto"/>
       </w:pPr>
       <w:r>
+        <w:t>Atualmente temos os ciclomotores e os autopropelidos. Ciclistastb estão expostos.</w:t>
+      </w:r>
+    </w:p>
+    <w:p>
+      <w:pPr>
+        <w:spacing w:after="160" w:line="300" w:lineRule="auto"/>
+      </w:pPr>
+      <w:r>
         <w:rPr>
           <w:rFonts w:ascii="Consolas" w:eastAsia="Consolas" w:hAnsi="Consolas" w:cs="Consolas"/>
           <w:color w:val="9AA0A6"/>
@@ -2303,6 +2269,10 @@
       </w:r>
       <w:r>
         <w:t>Férias na casa de parentes: confira piscina, sacada, tomadas e remédios ao alcance antes de soltar as crianças.</w:t>
+      </w:r>
+      <w:r>
+        <w:br/>
+        <w:t>Temos uma seção dedicada a visitação, linkar?</w:t>
       </w:r>
     </w:p>
     <w:p>
@@ -2362,6 +2332,20 @@
     </w:p>
     <w:p>
       <w:pPr>
+        <w:spacing w:after="160" w:line="300" w:lineRule="auto"/>
+      </w:pPr>
+      <w:r>
+        <w:t xml:space="preserve">Lembrar ou salientar e levar em consideração que há famílias com filhos de </w:t>
+      </w:r>
+      <w:r>
+        <w:t xml:space="preserve">diferentes idades assim como </w:t>
+      </w:r>
+      <w:r>
+        <w:t xml:space="preserve">vizinhos </w:t>
+      </w:r>
+    </w:p>
+    <w:p>
+      <w:pPr>
         <w:spacing w:before="180" w:after="60"/>
       </w:pPr>
       <w:r>
@@ -2424,7 +2408,13 @@
         <w:t xml:space="preserve">RS-0084  </w:t>
       </w:r>
       <w:r>
-        <w:t>Suspeita de bateria ou ímã engolido: pronto-socorro AGORA, mesmo sem sintomas.</w:t>
+        <w:t xml:space="preserve">Suspeita de bateria ou ímã engolido: pronto-socorro </w:t>
+      </w:r>
+      <w:r>
+        <w:t>REMOVER imediatamente</w:t>
+      </w:r>
+      <w:r>
+        <w:t>, mesmo sem sintomas.</w:t>
       </w:r>
     </w:p>
     <w:p>
@@ -2455,7 +2445,6 @@
           <w:sz w:val="14"/>
           <w:szCs w:val="14"/>
         </w:rPr>
-        <w:lastRenderedPageBreak/>
         <w:t xml:space="preserve">RS-0086  </w:t>
       </w:r>
       <w:r>
@@ -2572,7 +2561,13 @@
         <w:t xml:space="preserve">RS-0090  </w:t>
       </w:r>
       <w:r>
-        <w:t>Copos e garrafas de bebida alcoólica fora do alcance das crianças depois da festa.</w:t>
+        <w:t xml:space="preserve">Copos e garrafas de bebida alcoólica fora do alcance das crianças </w:t>
+      </w:r>
+      <w:r>
+        <w:t xml:space="preserve">durante e após </w:t>
+      </w:r>
+      <w:r>
+        <w:t>a festa.</w:t>
       </w:r>
     </w:p>
     <w:p>
@@ -2657,7 +2652,6 @@
           <w:sz w:val="34"/>
           <w:szCs w:val="34"/>
         </w:rPr>
-        <w:lastRenderedPageBreak/>
         <w:t>Portugal (texto em português de Portugal)</w:t>
       </w:r>
     </w:p>
@@ -2713,7 +2707,23 @@
         <w:t xml:space="preserve">RS-0096  </w:t>
       </w:r>
       <w:r>
-        <w:t>O INEM alerta todos os invernos para intoxicações por monóxido de carbono: braseiras em divisões fechadas, esquentadores na casa de banho, salamandras e lareiras sem tiragem. O gás não tem cheiro e mata durante o sono.</w:t>
+        <w:t xml:space="preserve">O </w:t>
+      </w:r>
+      <w:commentRangeStart w:id="3"/>
+      <w:r>
+        <w:t>INEM</w:t>
+      </w:r>
+      <w:commentRangeEnd w:id="3"/>
+      <w:r>
+        <w:rPr>
+          <w:rStyle w:val="Refdecomentrio"/>
+          <w:sz w:val="22"/>
+          <w:szCs w:val="22"/>
+        </w:rPr>
+        <w:commentReference w:id="3"/>
+      </w:r>
+      <w:r>
+        <w:t xml:space="preserve"> alerta todos os invernos para intoxicações por monóxido de carbono: braseiras em divisões fechadas, esquentadores na casa de banho, salamandras e lareiras sem tiragem. O gás não tem cheiro e mata durante o sono.</w:t>
       </w:r>
     </w:p>
     <w:p>
@@ -3055,7 +3065,6 @@
           <w:sz w:val="14"/>
           <w:szCs w:val="14"/>
         </w:rPr>
-        <w:lastRenderedPageBreak/>
         <w:t xml:space="preserve">RS-0111  </w:t>
       </w:r>
       <w:r>
@@ -3473,7 +3482,6 @@
           <w:sz w:val="14"/>
           <w:szCs w:val="14"/>
         </w:rPr>
-        <w:lastRenderedPageBreak/>
         <w:t xml:space="preserve">RS-0129  </w:t>
       </w:r>
       <w:r>
@@ -3888,7 +3896,6 @@
           <w:sz w:val="14"/>
           <w:szCs w:val="14"/>
         </w:rPr>
-        <w:lastRenderedPageBreak/>
         <w:t xml:space="preserve">RS-0146  </w:t>
       </w:r>
       <w:r>
@@ -3943,7 +3950,6 @@
           <w:sz w:val="34"/>
           <w:szCs w:val="34"/>
         </w:rPr>
-        <w:lastRenderedPageBreak/>
         <w:t>Espanha</w:t>
       </w:r>
     </w:p>
@@ -4413,7 +4419,6 @@
           <w:sz w:val="14"/>
           <w:szCs w:val="14"/>
         </w:rPr>
-        <w:lastRenderedPageBreak/>
         <w:t xml:space="preserve">RS-0168  </w:t>
       </w:r>
       <w:r>
@@ -4864,7 +4869,6 @@
           <w:sz w:val="14"/>
           <w:szCs w:val="14"/>
         </w:rPr>
-        <w:lastRenderedPageBreak/>
         <w:t xml:space="preserve">RS-0187  </w:t>
       </w:r>
       <w:r>
@@ -5205,7 +5209,6 @@
           <w:sz w:val="34"/>
           <w:szCs w:val="34"/>
         </w:rPr>
-        <w:lastRenderedPageBreak/>
         <w:t>Reino Unido</w:t>
       </w:r>
     </w:p>
@@ -5661,7 +5664,6 @@
           <w:sz w:val="16"/>
           <w:szCs w:val="16"/>
         </w:rPr>
-        <w:lastRenderedPageBreak/>
         <w:t>RESUMO</w:t>
       </w:r>
     </w:p>
@@ -6112,7 +6114,6 @@
           <w:sz w:val="16"/>
           <w:szCs w:val="16"/>
         </w:rPr>
-        <w:lastRenderedPageBreak/>
         <w:t>ORIENTACOES</w:t>
       </w:r>
     </w:p>
@@ -6198,7 +6199,6 @@
           <w:sz w:val="34"/>
           <w:szCs w:val="34"/>
         </w:rPr>
-        <w:lastRenderedPageBreak/>
         <w:t>Estados Unidos</w:t>
       </w:r>
     </w:p>
@@ -6642,7 +6642,6 @@
           <w:sz w:val="14"/>
           <w:szCs w:val="14"/>
         </w:rPr>
-        <w:lastRenderedPageBreak/>
         <w:t xml:space="preserve">RS-0261  </w:t>
       </w:r>
       <w:r>
@@ -7110,7 +7109,6 @@
           <w:sz w:val="14"/>
           <w:szCs w:val="14"/>
         </w:rPr>
-        <w:lastRenderedPageBreak/>
         <w:t xml:space="preserve">RS-0281  </w:t>
       </w:r>
       <w:r>
@@ -7553,7 +7551,6 @@
           <w:sz w:val="14"/>
           <w:szCs w:val="14"/>
         </w:rPr>
-        <w:lastRenderedPageBreak/>
         <w:t xml:space="preserve">RS-0300  </w:t>
       </w:r>
       <w:r>
@@ -7991,7 +7988,6 @@
           <w:sz w:val="34"/>
           <w:szCs w:val="34"/>
         </w:rPr>
-        <w:lastRenderedPageBreak/>
         <w:t>México</w:t>
       </w:r>
     </w:p>
@@ -8424,7 +8420,6 @@
           <w:sz w:val="14"/>
           <w:szCs w:val="14"/>
         </w:rPr>
-        <w:lastRenderedPageBreak/>
         <w:t xml:space="preserve">RS-0337  </w:t>
       </w:r>
       <w:r>
@@ -8898,7 +8893,6 @@
           <w:sz w:val="16"/>
           <w:szCs w:val="16"/>
         </w:rPr>
-        <w:lastRenderedPageBreak/>
         <w:t>ORIENTACOES</w:t>
       </w:r>
     </w:p>
@@ -9364,7 +9358,6 @@
           <w:sz w:val="14"/>
           <w:szCs w:val="14"/>
         </w:rPr>
-        <w:lastRenderedPageBreak/>
         <w:t xml:space="preserve">RS-0377  </w:t>
       </w:r>
       <w:r>
@@ -9402,7 +9395,6 @@
           <w:sz w:val="34"/>
           <w:szCs w:val="34"/>
         </w:rPr>
-        <w:lastRenderedPageBreak/>
         <w:t>Europa e alertas oficiais de cada país</w:t>
       </w:r>
     </w:p>
@@ -9861,7 +9853,6 @@
           <w:sz w:val="14"/>
           <w:szCs w:val="14"/>
         </w:rPr>
-        <w:lastRenderedPageBreak/>
         <w:t xml:space="preserve">RS-0398  </w:t>
       </w:r>
       <w:r>
@@ -10028,6 +10019,102 @@
     </w:sectPr>
   </w:body>
 </w:document>
+</file>
+
+<file path=word/comments.xml><?xml version="1.0" encoding="utf-8"?>
+<w:comments xmlns:wpc="http://schemas.microsoft.com/office/word/2010/wordprocessingCanvas" xmlns:cx="http://schemas.microsoft.com/office/drawing/2014/chartex" xmlns:cx1="http://schemas.microsoft.com/office/drawing/2015/9/8/chartex" xmlns:cx2="http://schemas.microsoft.com/office/drawing/2015/10/21/chartex" xmlns:cx3="http://schemas.microsoft.com/office/drawing/2016/5/9/chartex" xmlns:cx4="http://schemas.microsoft.com/office/drawing/2016/5/10/chartex" xmlns:cx5="http://schemas.microsoft.com/office/drawing/2016/5/11/chartex" xmlns:cx6="http://schemas.microsoft.com/office/drawing/2016/5/12/chartex" xmlns:cx7="http://schemas.microsoft.com/office/drawing/2016/5/13/chartex" xmlns:cx8="http://schemas.microsoft.com/office/drawing/2016/5/14/chartex" xmlns:mc="http://schemas.openxmlformats.org/markup-compatibility/2006" xmlns:aink="http://schemas.microsoft.com/office/drawing/2016/ink" xmlns:am3d="http://schemas.microsoft.com/office/drawing/2017/model3d" xmlns:o="urn:schemas-microsoft-com:office:office" xmlns:oel="http://schemas.microsoft.com/office/2019/extlst" xmlns:r="http://schemas.openxmlformats.org/officeDocument/2006/relationships" xmlns:m="http://schemas.openxmlformats.org/officeDocument/2006/math" xmlns:v="urn:schemas-microsoft-com:vml" xmlns:wp14="http://schemas.microsoft.com/office/word/2010/wordprocessingDrawing" xmlns:wp="http://schemas.openxmlformats.org/drawingml/2006/wordprocessingDrawing" xmlns:w10="urn:schemas-microsoft-com:office:word" xmlns:w="http://schemas.openxmlformats.org/wordprocessingml/2006/main" xmlns:w14="http://schemas.microsoft.com/office/word/2010/wordml" xmlns:w15="http://schemas.microsoft.com/office/word/2012/wordml" xmlns:w16cex="http://schemas.microsoft.com/office/word/2018/wordml/cex" xmlns:w16cid="http://schemas.microsoft.com/office/word/2016/wordml/cid" xmlns:w16="http://schemas.microsoft.com/office/word/2018/wordml" xmlns:w16du="http://schemas.microsoft.com/office/word/2023/wordml/word16du" xmlns:w16sdtdh="http://schemas.microsoft.com/office/word/2020/wordml/sdtdatahash" xmlns:w16sdtfl="http://schemas.microsoft.com/office/word/2024/wordml/sdtformatlock" xmlns:w16se="http://schemas.microsoft.com/office/word/2015/wordml/symex" xmlns:wpg="http://schemas.microsoft.com/office/word/2010/wordprocessingGroup" xmlns:wpi="http://schemas.microsoft.com/office/word/2010/wordprocessingInk" xmlns:wne="http://schemas.microsoft.com/office/word/2006/wordml" xmlns:wps="http://schemas.microsoft.com/office/word/2010/wordprocessingShape" mc:Ignorable="w14 w15 w16se w16cid w16 w16cex w16sdtdh w16sdtfl w16du wp14">
+  <w:comment w:id="0" w:author="AGNALDO FONTINELE" w:date="2026-10-21T23:12:00Z" w:initials="AF">
+    <w:p>
+      <w:pPr>
+        <w:pStyle w:val="Textodecomentrio"/>
+      </w:pPr>
+      <w:r>
+        <w:rPr>
+          <w:rStyle w:val="Refdecomentrio"/>
+        </w:rPr>
+        <w:annotationRef/>
+      </w:r>
+      <w:r>
+        <w:t>Quadra=Quadrimestre, ao meu ver mais autoexplicativo.</w:t>
+      </w:r>
+    </w:p>
+  </w:comment>
+  <w:comment w:id="1" w:author="AGNALDO FONTINELE" w:date="2026-10-21T23:14:00Z" w:initials="AF">
+    <w:p>
+      <w:pPr>
+        <w:pStyle w:val="Textodecomentrio"/>
+      </w:pPr>
+      <w:r>
+        <w:rPr>
+          <w:rStyle w:val="Refdecomentrio"/>
+        </w:rPr>
+        <w:annotationRef/>
+      </w:r>
+      <w:r>
+        <w:t>Acredito que "no quintal da sua casa" seja mais adequado</w:t>
+      </w:r>
+    </w:p>
+  </w:comment>
+  <w:comment w:id="2" w:author="AGNALDO FONTINELE" w:date="2026-10-21T23:27:00Z" w:initials="AF">
+    <w:p>
+      <w:pPr>
+        <w:pStyle w:val="Textodecomentrio"/>
+      </w:pPr>
+      <w:r>
+        <w:rPr>
+          <w:rStyle w:val="Refdecomentrio"/>
+        </w:rPr>
+        <w:annotationRef/>
+      </w:r>
+      <w:r>
+        <w:t>Acredito que a referência se dá devido alguns estados já abordaram o tema em suas leis. Mesmo em estados que ainda não o fizeram devem ser altamente contraindicado</w:t>
+      </w:r>
+    </w:p>
+  </w:comment>
+  <w:comment w:id="3" w:author="AGNALDO FONTINELE" w:date="2026-10-21T23:35:00Z" w:initials="AF">
+    <w:p>
+      <w:pPr>
+        <w:pStyle w:val="Textodecomentrio"/>
+      </w:pPr>
+      <w:r>
+        <w:rPr>
+          <w:rStyle w:val="Refdecomentrio"/>
+        </w:rPr>
+        <w:annotationRef/>
+      </w:r>
+      <w:r>
+        <w:t>Siglas sempre explicadas</w:t>
+      </w:r>
+    </w:p>
+  </w:comment>
+</w:comments>
+</file>
+
+<file path=word/commentsExtended.xml><?xml version="1.0" encoding="utf-8"?>
+<w15:commentsEx xmlns:wpc="http://schemas.microsoft.com/office/word/2010/wordprocessingCanvas" xmlns:cx="http://schemas.microsoft.com/office/drawing/2014/chartex" xmlns:cx1="http://schemas.microsoft.com/office/drawing/2015/9/8/chartex" xmlns:cx2="http://schemas.microsoft.com/office/drawing/2015/10/21/chartex" xmlns:cx3="http://schemas.microsoft.com/office/drawing/2016/5/9/chartex" xmlns:cx4="http://schemas.microsoft.com/office/drawing/2016/5/10/chartex" xmlns:cx5="http://schemas.microsoft.com/office/drawing/2016/5/11/chartex" xmlns:cx6="http://schemas.microsoft.com/office/drawing/2016/5/12/chartex" xmlns:cx7="http://schemas.microsoft.com/office/drawing/2016/5/13/chartex" xmlns:cx8="http://schemas.microsoft.com/office/drawing/2016/5/14/chartex" xmlns:mc="http://schemas.openxmlformats.org/markup-compatibility/2006" xmlns:aink="http://schemas.microsoft.com/office/drawing/2016/ink" xmlns:am3d="http://schemas.microsoft.com/office/drawing/2017/model3d" xmlns:o="urn:schemas-microsoft-com:office:office" xmlns:oel="http://schemas.microsoft.com/office/2019/extlst" xmlns:r="http://schemas.openxmlformats.org/officeDocument/2006/relationships" xmlns:m="http://schemas.openxmlformats.org/officeDocument/2006/math" xmlns:v="urn:schemas-microsoft-com:vml" xmlns:wp14="http://schemas.microsoft.com/office/word/2010/wordprocessingDrawing" xmlns:wp="http://schemas.openxmlformats.org/drawingml/2006/wordprocessingDrawing" xmlns:w10="urn:schemas-microsoft-com:office:word" xmlns:w="http://schemas.openxmlformats.org/wordprocessingml/2006/main" xmlns:w14="http://schemas.microsoft.com/office/word/2010/wordml" xmlns:w15="http://schemas.microsoft.com/office/word/2012/wordml" xmlns:w16cex="http://schemas.microsoft.com/office/word/2018/wordml/cex" xmlns:w16cid="http://schemas.microsoft.com/office/word/2016/wordml/cid" xmlns:w16="http://schemas.microsoft.com/office/word/2018/wordml" xmlns:w16du="http://schemas.microsoft.com/office/word/2023/wordml/word16du" xmlns:w16sdtdh="http://schemas.microsoft.com/office/word/2020/wordml/sdtdatahash" xmlns:w16sdtfl="http://schemas.microsoft.com/office/word/2024/wordml/sdtformatlock" xmlns:w16se="http://schemas.microsoft.com/office/word/2015/wordml/symex" xmlns:wpg="http://schemas.microsoft.com/office/word/2010/wordprocessingGroup" xmlns:wpi="http://schemas.microsoft.com/office/word/2010/wordprocessingInk" xmlns:wne="http://schemas.microsoft.com/office/word/2006/wordml" xmlns:wps="http://schemas.microsoft.com/office/word/2010/wordprocessingShape" mc:Ignorable="w14 w15 w16se w16cid w16 w16cex w16sdtdh w16sdtfl w16du wp14">
+  <w15:commentEx w15:paraId="7E4198DF" w15:done="0"/>
+  <w15:commentEx w15:paraId="78D18376" w15:done="0"/>
+  <w15:commentEx w15:paraId="4AA97882" w15:done="0"/>
+  <w15:commentEx w15:paraId="438B2AD4" w15:done="0"/>
+</w15:commentsEx>
+</file>
+
+<file path=word/commentsExtensible.xml><?xml version="1.0" encoding="utf-8"?>
+<w16cex:commentsExtensible xmlns:wpc="http://schemas.microsoft.com/office/word/2010/wordprocessingCanvas" xmlns:cx="http://schemas.microsoft.com/office/drawing/2014/chartex" xmlns:cx1="http://schemas.microsoft.com/office/drawing/2015/9/8/chartex" xmlns:cx2="http://schemas.microsoft.com/office/drawing/2015/10/21/chartex" xmlns:cx3="http://schemas.microsoft.com/office/drawing/2016/5/9/chartex" xmlns:cx4="http://schemas.microsoft.com/office/drawing/2016/5/10/chartex" xmlns:cx5="http://schemas.microsoft.com/office/drawing/2016/5/11/chartex" xmlns:cx6="http://schemas.microsoft.com/office/drawing/2016/5/12/chartex" xmlns:cx7="http://schemas.microsoft.com/office/drawing/2016/5/13/chartex" xmlns:cx8="http://schemas.microsoft.com/office/drawing/2016/5/14/chartex" xmlns:cr="http://schemas.microsoft.com/office/comments/2020/reactions" xmlns:mc="http://schemas.openxmlformats.org/markup-compatibility/2006" xmlns:aink="http://schemas.microsoft.com/office/drawing/2016/ink" xmlns:am3d="http://schemas.microsoft.com/office/drawing/2017/model3d" xmlns:o="urn:schemas-microsoft-com:office:office" xmlns:oel="http://schemas.microsoft.com/office/2019/extlst" xmlns:r="http://schemas.openxmlformats.org/officeDocument/2006/relationships" xmlns:m="http://schemas.openxmlformats.org/officeDocument/2006/math" xmlns:v="urn:schemas-microsoft-com:vml" xmlns:wp14="http://schemas.microsoft.com/office/word/2010/wordprocessingDrawing" xmlns:wp="http://schemas.openxmlformats.org/drawingml/2006/wordprocessingDrawing" xmlns:w10="urn:schemas-microsoft-com:office:word" xmlns:w="http://schemas.openxmlformats.org/wordprocessingml/2006/main" xmlns:w14="http://schemas.microsoft.com/office/word/2010/wordml" xmlns:w15="http://schemas.microsoft.com/office/word/2012/wordml" xmlns:w16cex="http://schemas.microsoft.com/office/word/2018/wordml/cex" xmlns:w16cid="http://schemas.microsoft.com/office/word/2016/wordml/cid" xmlns:w16="http://schemas.microsoft.com/office/word/2018/wordml" xmlns:w16du="http://schemas.microsoft.com/office/word/2023/wordml/word16du" xmlns:w16sdtdh="http://schemas.microsoft.com/office/word/2020/wordml/sdtdatahash" xmlns:w16sdtfl="http://schemas.microsoft.com/office/word/2024/wordml/sdtformatlock" xmlns:w16se="http://schemas.microsoft.com/office/word/2015/wordml/symex" xmlns:wpg="http://schemas.microsoft.com/office/word/2010/wordprocessingGroup" xmlns:wpi="http://schemas.microsoft.com/office/word/2010/wordprocessingInk" xmlns:wne="http://schemas.microsoft.com/office/word/2006/wordml" xmlns:wps="http://schemas.microsoft.com/office/word/2010/wordprocessingShape" mc:Ignorable="w14 w15 w16se w16cid w16 w16cex w16sdtdh w16sdtfl cr w16du wp14">
+  <w16cex:commentExtensible w16cex:durableId="375DC779" w16cex:dateUtc="2026-10-22T02:12:00Z"/>
+  <w16cex:commentExtensible w16cex:durableId="336DC97C" w16cex:dateUtc="2026-10-22T02:14:00Z"/>
+  <w16cex:commentExtensible w16cex:durableId="2432B552" w16cex:dateUtc="2026-10-22T02:27:00Z"/>
+  <w16cex:commentExtensible w16cex:durableId="0271CC0B" w16cex:dateUtc="2026-10-22T02:35:00Z"/>
+</w16cex:commentsExtensible>
+</file>
+
+<file path=word/commentsIds.xml><?xml version="1.0" encoding="utf-8"?>
+<w16cid:commentsIds xmlns:wpc="http://schemas.microsoft.com/office/word/2010/wordprocessingCanvas" xmlns:cx="http://schemas.microsoft.com/office/drawing/2014/chartex" xmlns:cx1="http://schemas.microsoft.com/office/drawing/2015/9/8/chartex" xmlns:cx2="http://schemas.microsoft.com/office/drawing/2015/10/21/chartex" xmlns:cx3="http://schemas.microsoft.com/office/drawing/2016/5/9/chartex" xmlns:cx4="http://schemas.microsoft.com/office/drawing/2016/5/10/chartex" xmlns:cx5="http://schemas.microsoft.com/office/drawing/2016/5/11/chartex" xmlns:cx6="http://schemas.microsoft.com/office/drawing/2016/5/12/chartex" xmlns:cx7="http://schemas.microsoft.com/office/drawing/2016/5/13/chartex" xmlns:cx8="http://schemas.microsoft.com/office/drawing/2016/5/14/chartex" xmlns:mc="http://schemas.openxmlformats.org/markup-compatibility/2006" xmlns:aink="http://schemas.microsoft.com/office/drawing/2016/ink" xmlns:am3d="http://schemas.microsoft.com/office/drawing/2017/model3d" xmlns:o="urn:schemas-microsoft-com:office:office" xmlns:oel="http://schemas.microsoft.com/office/2019/extlst" xmlns:r="http://schemas.openxmlformats.org/officeDocument/2006/relationships" xmlns:m="http://schemas.openxmlformats.org/officeDocument/2006/math" xmlns:v="urn:schemas-microsoft-com:vml" xmlns:wp14="http://schemas.microsoft.com/office/word/2010/wordprocessingDrawing" xmlns:wp="http://schemas.openxmlformats.org/drawingml/2006/wordprocessingDrawing" xmlns:w10="urn:schemas-microsoft-com:office:word" xmlns:w="http://schemas.openxmlformats.org/wordprocessingml/2006/main" xmlns:w14="http://schemas.microsoft.com/office/word/2010/wordml" xmlns:w15="http://schemas.microsoft.com/office/word/2012/wordml" xmlns:w16cex="http://schemas.microsoft.com/office/word/2018/wordml/cex" xmlns:w16cid="http://schemas.microsoft.com/office/word/2016/wordml/cid" xmlns:w16="http://schemas.microsoft.com/office/word/2018/wordml" xmlns:w16du="http://schemas.microsoft.com/office/word/2023/wordml/word16du" xmlns:w16sdtdh="http://schemas.microsoft.com/office/word/2020/wordml/sdtdatahash" xmlns:w16sdtfl="http://schemas.microsoft.com/office/word/2024/wordml/sdtformatlock" xmlns:w16se="http://schemas.microsoft.com/office/word/2015/wordml/symex" xmlns:wpg="http://schemas.microsoft.com/office/word/2010/wordprocessingGroup" xmlns:wpi="http://schemas.microsoft.com/office/word/2010/wordprocessingInk" xmlns:wne="http://schemas.microsoft.com/office/word/2006/wordml" xmlns:wps="http://schemas.microsoft.com/office/word/2010/wordprocessingShape" mc:Ignorable="w14 w15 w16se w16cid w16 w16cex w16sdtdh w16sdtfl w16du wp14">
+  <w16cid:commentId w16cid:paraId="7E4198DF" w16cid:durableId="375DC779"/>
+  <w16cid:commentId w16cid:paraId="78D18376" w16cid:durableId="336DC97C"/>
+  <w16cid:commentId w16cid:paraId="4AA97882" w16cid:durableId="2432B552"/>
+  <w16cid:commentId w16cid:paraId="438B2AD4" w16cid:durableId="0271CC0B"/>
+</w16cid:commentsIds>
 </file>
 
 <file path=word/numbering.xml><?xml version="1.0" encoding="utf-8"?>
@@ -10125,6 +10212,14 @@
     </w:lvlOverride>
   </w:num>
 </w:numbering>
+</file>
+
+<file path=word/people.xml><?xml version="1.0" encoding="utf-8"?>
+<w15:people xmlns:wpc="http://schemas.microsoft.com/office/word/2010/wordprocessingCanvas" xmlns:cx="http://schemas.microsoft.com/office/drawing/2014/chartex" xmlns:cx1="http://schemas.microsoft.com/office/drawing/2015/9/8/chartex" xmlns:cx2="http://schemas.microsoft.com/office/drawing/2015/10/21/chartex" xmlns:cx3="http://schemas.microsoft.com/office/drawing/2016/5/9/chartex" xmlns:cx4="http://schemas.microsoft.com/office/drawing/2016/5/10/chartex" xmlns:cx5="http://schemas.microsoft.com/office/drawing/2016/5/11/chartex" xmlns:cx6="http://schemas.microsoft.com/office/drawing/2016/5/12/chartex" xmlns:cx7="http://schemas.microsoft.com/office/drawing/2016/5/13/chartex" xmlns:cx8="http://schemas.microsoft.com/office/drawing/2016/5/14/chartex" xmlns:mc="http://schemas.openxmlformats.org/markup-compatibility/2006" xmlns:aink="http://schemas.microsoft.com/office/drawing/2016/ink" xmlns:am3d="http://schemas.microsoft.com/office/drawing/2017/model3d" xmlns:o="urn:schemas-microsoft-com:office:office" xmlns:oel="http://schemas.microsoft.com/office/2019/extlst" xmlns:r="http://schemas.openxmlformats.org/officeDocument/2006/relationships" xmlns:m="http://schemas.openxmlformats.org/officeDocument/2006/math" xmlns:v="urn:schemas-microsoft-com:vml" xmlns:wp14="http://schemas.microsoft.com/office/word/2010/wordprocessingDrawing" xmlns:wp="http://schemas.openxmlformats.org/drawingml/2006/wordprocessingDrawing" xmlns:w10="urn:schemas-microsoft-com:office:word" xmlns:w="http://schemas.openxmlformats.org/wordprocessingml/2006/main" xmlns:w14="http://schemas.microsoft.com/office/word/2010/wordml" xmlns:w15="http://schemas.microsoft.com/office/word/2012/wordml" xmlns:w16cex="http://schemas.microsoft.com/office/word/2018/wordml/cex" xmlns:w16cid="http://schemas.microsoft.com/office/word/2016/wordml/cid" xmlns:w16="http://schemas.microsoft.com/office/word/2018/wordml" xmlns:w16du="http://schemas.microsoft.com/office/word/2023/wordml/word16du" xmlns:w16sdtdh="http://schemas.microsoft.com/office/word/2020/wordml/sdtdatahash" xmlns:w16sdtfl="http://schemas.microsoft.com/office/word/2024/wordml/sdtformatlock" xmlns:w16se="http://schemas.microsoft.com/office/word/2015/wordml/symex" xmlns:wpg="http://schemas.microsoft.com/office/word/2010/wordprocessingGroup" xmlns:wpi="http://schemas.microsoft.com/office/word/2010/wordprocessingInk" xmlns:wne="http://schemas.microsoft.com/office/word/2006/wordml" xmlns:wps="http://schemas.microsoft.com/office/word/2010/wordprocessingShape" mc:Ignorable="w14 w15 w16se w16cid w16 w16cex w16sdtdh w16sdtfl w16du wp14">
+  <w15:person w15:author="AGNALDO FONTINELE">
+    <w15:presenceInfo w15:providerId="Windows Live" w15:userId="63722699e97e103b"/>
+  </w15:person>
+</w15:people>
 </file>
 
 <file path=word/styles.xml><?xml version="1.0" encoding="utf-8"?>
@@ -10724,6 +10819,69 @@
       <w:szCs w:val="20"/>
     </w:rPr>
   </w:style>
+  <w:style w:type="character" w:styleId="Refdecomentrio">
+    <w:name w:val="annotation reference"/>
+    <w:basedOn w:val="Fontepargpadro"/>
+    <w:uiPriority w:val="99"/>
+    <w:semiHidden/>
+    <w:unhideWhenUsed/>
+    <w:rsid w:val="00E65221"/>
+    <w:rPr>
+      <w:sz w:val="16"/>
+      <w:szCs w:val="16"/>
+    </w:rPr>
+  </w:style>
+  <w:style w:type="paragraph" w:styleId="Textodecomentrio">
+    <w:name w:val="annotation text"/>
+    <w:basedOn w:val="Normal"/>
+    <w:link w:val="TextodecomentrioChar"/>
+    <w:uiPriority w:val="99"/>
+    <w:unhideWhenUsed/>
+    <w:rsid w:val="00E65221"/>
+    <w:rPr>
+      <w:sz w:val="20"/>
+      <w:szCs w:val="20"/>
+    </w:rPr>
+  </w:style>
+  <w:style w:type="character" w:customStyle="1" w:styleId="TextodecomentrioChar">
+    <w:name w:val="Texto de comentário Char"/>
+    <w:basedOn w:val="Fontepargpadro"/>
+    <w:link w:val="Textodecomentrio"/>
+    <w:uiPriority w:val="99"/>
+    <w:rsid w:val="00E65221"/>
+    <w:rPr>
+      <w:sz w:val="20"/>
+      <w:szCs w:val="20"/>
+    </w:rPr>
+  </w:style>
+  <w:style w:type="paragraph" w:styleId="Assuntodocomentrio">
+    <w:name w:val="annotation subject"/>
+    <w:basedOn w:val="Textodecomentrio"/>
+    <w:next w:val="Textodecomentrio"/>
+    <w:link w:val="AssuntodocomentrioChar"/>
+    <w:uiPriority w:val="99"/>
+    <w:semiHidden/>
+    <w:unhideWhenUsed/>
+    <w:rsid w:val="00E65221"/>
+    <w:rPr>
+      <w:b/>
+      <w:bCs/>
+    </w:rPr>
+  </w:style>
+  <w:style w:type="character" w:customStyle="1" w:styleId="AssuntodocomentrioChar">
+    <w:name w:val="Assunto do comentário Char"/>
+    <w:basedOn w:val="TextodecomentrioChar"/>
+    <w:link w:val="Assuntodocomentrio"/>
+    <w:uiPriority w:val="99"/>
+    <w:semiHidden/>
+    <w:rsid w:val="00E65221"/>
+    <w:rPr>
+      <w:b/>
+      <w:bCs/>
+      <w:sz w:val="20"/>
+      <w:szCs w:val="20"/>
+    </w:rPr>
+  </w:style>
 </w:styles>
 </file>
 

</xml_diff>